<commit_message>
Update task assignments: swap roles across all 4 members
New role distribution:
- Sirac Ketenoglu  → Backend Lead      (feature/backend-core)
- Emre Turan       → Auth & Feedback   (feature/auth-and-feedback)
- Reis Yildiz      → Frontend Lead     (feature/frontend-integration)
- Baris Kucukkaya  → Test & Reservation (feature/reservation-and-tests)

Updated TeamRebsDev_TaskAssignment.docx and TeamPlan_RebsDev.html
with new person cards, sprint backlog, timeline chips and risk notes.

Co-Authored-By: Claude Sonnet 4.6 <noreply@anthropic.com>
</commit_message>
<xml_diff>
--- a/Documentation/TeamRebsDev_TaskAssignment.docx
+++ b/Documentation/TeamRebsDev_TaskAssignment.docx
@@ -115,6 +115,72 @@
         <w:tc>
           <w:tcPr>
             <w:tcBorders>
+              <w:top w:val="single" w:color="22C55E" w:sz="12"/>
+              <w:left w:val="single" w:color="CBD5E1" w:sz="4"/>
+              <w:bottom w:val="single" w:color="CBD5E1" w:sz="4"/>
+              <w:right w:val="single" w:color="CBD5E1" w:sz="4"/>
+            </w:tcBorders>
+            <w:shd w:fill="F8FAFF" w:val="clear"/>
+            <w:tcMar>
+              <w:top w:type="dxa" w:w="120"/>
+              <w:left w:type="dxa" w:w="120"/>
+              <w:bottom w:type="dxa" w:w="120"/>
+              <w:right w:type="dxa" w:w="120"/>
+            </w:tcMar>
+          </w:tcPr>
+          <w:p>
+            <w:pPr>
+              <w:spacing w:after="60" w:before="0"/>
+              <w:jc w:val="center"/>
+            </w:pPr>
+            <w:r>
+              <w:rPr>
+                <w:rFonts w:ascii="Arial Black" w:cs="Arial Black" w:eastAsia="Arial Black" w:hAnsi="Arial Black"/>
+                <w:b/>
+                <w:bCs/>
+                <w:color w:val="22C55E"/>
+                <w:sz w:val="28"/>
+                <w:szCs w:val="28"/>
+              </w:rPr>
+              <w:t xml:space="preserve">SK</w:t>
+            </w:r>
+          </w:p>
+          <w:p>
+            <w:pPr>
+              <w:spacing w:after="40" w:before="0"/>
+              <w:jc w:val="center"/>
+            </w:pPr>
+            <w:r>
+              <w:rPr>
+                <w:rFonts w:ascii="Arial" w:cs="Arial" w:eastAsia="Arial" w:hAnsi="Arial"/>
+                <w:b/>
+                <w:bCs/>
+                <w:color w:val="1A1F5E"/>
+                <w:sz w:val="19"/>
+                <w:szCs w:val="19"/>
+              </w:rPr>
+              <w:t xml:space="preserve">Sirac Ketenoglu</w:t>
+            </w:r>
+          </w:p>
+          <w:p>
+            <w:pPr>
+              <w:spacing w:after="0" w:before="0"/>
+              <w:jc w:val="center"/>
+            </w:pPr>
+            <w:r>
+              <w:rPr>
+                <w:rFonts w:ascii="Arial" w:cs="Arial" w:eastAsia="Arial" w:hAnsi="Arial"/>
+                <w:color w:val="64748B"/>
+                <w:sz w:val="17"/>
+                <w:szCs w:val="17"/>
+              </w:rPr>
+              <w:t xml:space="preserve">Backend Lead</w:t>
+            </w:r>
+          </w:p>
+        </w:tc>
+        <w:tc>
+          <w:tcPr>
+            <w:tcBorders>
               <w:top w:val="single" w:color="4F6EF7" w:sz="12"/>
               <w:left w:val="single" w:color="CBD5E1" w:sz="4"/>
               <w:bottom w:val="single" w:color="CBD5E1" w:sz="4"/>
@@ -174,14 +240,14 @@
                 <w:sz w:val="17"/>
                 <w:szCs w:val="17"/>
               </w:rPr>
-              <w:t xml:space="preserve">Backend Lead</w:t>
-            </w:r>
-          </w:p>
-        </w:tc>
-        <w:tc>
-          <w:tcPr>
-            <w:tcBorders>
-              <w:top w:val="single" w:color="22C55E" w:sz="12"/>
+              <w:t xml:space="preserve">Auth &amp; Feedback</w:t>
+            </w:r>
+          </w:p>
+        </w:tc>
+        <w:tc>
+          <w:tcPr>
+            <w:tcBorders>
+              <w:top w:val="single" w:color="F59E0B" w:sz="12"/>
               <w:left w:val="single" w:color="CBD5E1" w:sz="4"/>
               <w:bottom w:val="single" w:color="CBD5E1" w:sz="4"/>
               <w:right w:val="single" w:color="CBD5E1" w:sz="4"/>
@@ -204,11 +270,11 @@
                 <w:rFonts w:ascii="Arial Black" w:cs="Arial Black" w:eastAsia="Arial Black" w:hAnsi="Arial Black"/>
                 <w:b/>
                 <w:bCs/>
-                <w:color w:val="22C55E"/>
+                <w:color w:val="F59E0B"/>
                 <w:sz w:val="28"/>
                 <w:szCs w:val="28"/>
               </w:rPr>
-              <w:t xml:space="preserve">SK</w:t>
+              <w:t xml:space="preserve">RY</w:t>
             </w:r>
           </w:p>
           <w:p>
@@ -225,7 +291,7 @@
                 <w:sz w:val="19"/>
                 <w:szCs w:val="19"/>
               </w:rPr>
-              <w:t xml:space="preserve">Sirac Ketenoglu</w:t>
+              <w:t xml:space="preserve">Reis Yıldız</w:t>
             </w:r>
           </w:p>
           <w:p>
@@ -247,7 +313,7 @@
         <w:tc>
           <w:tcPr>
             <w:tcBorders>
-              <w:top w:val="single" w:color="F59E0B" w:sz="12"/>
+              <w:top w:val="single" w:color="EF4444" w:sz="12"/>
               <w:left w:val="single" w:color="CBD5E1" w:sz="4"/>
               <w:bottom w:val="single" w:color="CBD5E1" w:sz="4"/>
               <w:right w:val="single" w:color="CBD5E1" w:sz="4"/>
@@ -270,11 +336,11 @@
                 <w:rFonts w:ascii="Arial Black" w:cs="Arial Black" w:eastAsia="Arial Black" w:hAnsi="Arial Black"/>
                 <w:b/>
                 <w:bCs/>
-                <w:color w:val="F59E0B"/>
+                <w:color w:val="EF4444"/>
                 <w:sz w:val="28"/>
                 <w:szCs w:val="28"/>
               </w:rPr>
-              <w:t xml:space="preserve">RY</w:t>
+              <w:t xml:space="preserve">BK</w:t>
             </w:r>
           </w:p>
           <w:p>
@@ -291,7 +357,7 @@
                 <w:sz w:val="19"/>
                 <w:szCs w:val="19"/>
               </w:rPr>
-              <w:t xml:space="preserve">Reis Yıldız</w:t>
+              <w:t xml:space="preserve">Barış Küçükkıya</w:t>
             </w:r>
           </w:p>
           <w:p>
@@ -307,72 +373,6 @@
                 <w:szCs w:val="17"/>
               </w:rPr>
               <w:t xml:space="preserve">Test &amp; Rezervasyon</w:t>
-            </w:r>
-          </w:p>
-        </w:tc>
-        <w:tc>
-          <w:tcPr>
-            <w:tcBorders>
-              <w:top w:val="single" w:color="EF4444" w:sz="12"/>
-              <w:left w:val="single" w:color="CBD5E1" w:sz="4"/>
-              <w:bottom w:val="single" w:color="CBD5E1" w:sz="4"/>
-              <w:right w:val="single" w:color="CBD5E1" w:sz="4"/>
-            </w:tcBorders>
-            <w:shd w:fill="F8FAFF" w:val="clear"/>
-            <w:tcMar>
-              <w:top w:type="dxa" w:w="120"/>
-              <w:left w:type="dxa" w:w="120"/>
-              <w:bottom w:type="dxa" w:w="120"/>
-              <w:right w:type="dxa" w:w="120"/>
-            </w:tcMar>
-          </w:tcPr>
-          <w:p>
-            <w:pPr>
-              <w:spacing w:after="60" w:before="0"/>
-              <w:jc w:val="center"/>
-            </w:pPr>
-            <w:r>
-              <w:rPr>
-                <w:rFonts w:ascii="Arial Black" w:cs="Arial Black" w:eastAsia="Arial Black" w:hAnsi="Arial Black"/>
-                <w:b/>
-                <w:bCs/>
-                <w:color w:val="EF4444"/>
-                <w:sz w:val="28"/>
-                <w:szCs w:val="28"/>
-              </w:rPr>
-              <w:t xml:space="preserve">BK</w:t>
-            </w:r>
-          </w:p>
-          <w:p>
-            <w:pPr>
-              <w:spacing w:after="40" w:before="0"/>
-              <w:jc w:val="center"/>
-            </w:pPr>
-            <w:r>
-              <w:rPr>
-                <w:rFonts w:ascii="Arial" w:cs="Arial" w:eastAsia="Arial" w:hAnsi="Arial"/>
-                <w:b/>
-                <w:bCs/>
-                <w:color w:val="1A1F5E"/>
-                <w:sz w:val="19"/>
-                <w:szCs w:val="19"/>
-              </w:rPr>
-              <w:t xml:space="preserve">Barış Küçükkıya</w:t>
-            </w:r>
-          </w:p>
-          <w:p>
-            <w:pPr>
-              <w:spacing w:after="0" w:before="0"/>
-              <w:jc w:val="center"/>
-            </w:pPr>
-            <w:r>
-              <w:rPr>
-                <w:rFonts w:ascii="Arial" w:cs="Arial" w:eastAsia="Arial" w:hAnsi="Arial"/>
-                <w:color w:val="64748B"/>
-                <w:sz w:val="17"/>
-                <w:szCs w:val="17"/>
-              </w:rPr>
-              <w:t xml:space="preserve">Auth &amp; Feedback</w:t>
             </w:r>
           </w:p>
         </w:tc>
@@ -723,7 +723,7 @@
         </w:rPr>
         <w:t xml:space="preserve">GitHub Repo: </w:t>
       </w:r>
-      <w:hyperlink w:history="1" r:id="rId7spvnonndc9a7iwhnmtu_">
+      <w:hyperlink w:history="1" r:id="rIdljwdg2xadfls-qa7xvynb">
         <w:r>
           <w:rPr>
             <w:rFonts w:ascii="Consolas" w:cs="Consolas" w:eastAsia="Consolas" w:hAnsi="Consolas"/>
@@ -1080,7 +1080,7 @@
           <w:sz w:val="24"/>
           <w:szCs w:val="24"/>
         </w:rPr>
-        <w:t xml:space="preserve">3.1 Emre Turan – Backend Lead / Repo Sahibi</w:t>
+        <w:t xml:space="preserve">3.1 Sirac Ketenoglu – Backend Lead</w:t>
       </w:r>
     </w:p>
     <w:p>
@@ -1112,12 +1112,12 @@
           <w:tcPr>
             <w:tcW w:type="dxa" w:w="1200"/>
             <w:tcBorders>
-              <w:top w:val="single" w:color="4F6EF7" w:sz="4"/>
-              <w:left w:val="single" w:color="4F6EF7" w:sz="4"/>
-              <w:bottom w:val="single" w:color="4F6EF7" w:sz="4"/>
-              <w:right w:val="single" w:color="4F6EF7" w:sz="4"/>
-            </w:tcBorders>
-            <w:shd w:fill="4F6EF7" w:val="clear"/>
+              <w:top w:val="single" w:color="22C55E" w:sz="4"/>
+              <w:left w:val="single" w:color="22C55E" w:sz="4"/>
+              <w:bottom w:val="single" w:color="22C55E" w:sz="4"/>
+              <w:right w:val="single" w:color="22C55E" w:sz="4"/>
+            </w:tcBorders>
+            <w:shd w:fill="22C55E" w:val="clear"/>
             <w:tcMar>
               <w:top w:type="dxa" w:w="160"/>
               <w:left w:type="dxa" w:w="140"/>
@@ -1139,7 +1139,7 @@
                 <w:sz w:val="36"/>
                 <w:szCs w:val="36"/>
               </w:rPr>
-              <w:t xml:space="preserve">ET</w:t>
+              <w:t xml:space="preserve">SK</w:t>
             </w:r>
           </w:p>
         </w:tc>
@@ -1148,7 +1148,7 @@
             <w:tcW w:type="dxa" w:w="8160"/>
             <w:tcBorders>
               <w:top w:val="single" w:color="CBD5E1" w:sz="4"/>
-              <w:left w:val="single" w:color="4F6EF7" w:sz="8"/>
+              <w:left w:val="single" w:color="22C55E" w:sz="8"/>
               <w:bottom w:val="single" w:color="CBD5E1" w:sz="4"/>
               <w:right w:val="single" w:color="CBD5E1" w:sz="4"/>
             </w:tcBorders>
@@ -1173,7 +1173,7 @@
                 <w:sz w:val="26"/>
                 <w:szCs w:val="26"/>
               </w:rPr>
-              <w:t xml:space="preserve">Emre Turan</w:t>
+              <w:t xml:space="preserve">Sirac Ketenoglu</w:t>
             </w:r>
           </w:p>
           <w:p>
@@ -1187,7 +1187,7 @@
                 <w:sz w:val="20"/>
                 <w:szCs w:val="20"/>
               </w:rPr>
-              <w:t xml:space="preserve">Backend Lead / Repo Sahibi</w:t>
+              <w:t xml:space="preserve">Backend Lead</w:t>
             </w:r>
           </w:p>
           <w:p>
@@ -1688,7 +1688,7 @@
                 <w:sz w:val="18"/>
                 <w:szCs w:val="18"/>
               </w:rPr>
-              <w:t xml:space="preserve"># GitHub'da Pull Request aç, Sirac veya Barış'ı reviewer olarak ekle</w:t>
+              <w:t xml:space="preserve"># GitHub'da Pull Request aç, Emre veya Barış'ı reviewer olarak ekle</w:t>
             </w:r>
           </w:p>
         </w:tc>
@@ -1744,7 +1744,7 @@
           <w:sz w:val="24"/>
           <w:szCs w:val="24"/>
         </w:rPr>
-        <w:t xml:space="preserve">3.2 Sirac Ketenoglu – Frontend Lead</w:t>
+        <w:t xml:space="preserve">3.2 Emre Turan – Auth &amp; Feedback Sistemi</w:t>
       </w:r>
     </w:p>
     <w:p>
@@ -1776,12 +1776,12 @@
           <w:tcPr>
             <w:tcW w:type="dxa" w:w="1200"/>
             <w:tcBorders>
-              <w:top w:val="single" w:color="22C55E" w:sz="4"/>
-              <w:left w:val="single" w:color="22C55E" w:sz="4"/>
-              <w:bottom w:val="single" w:color="22C55E" w:sz="4"/>
-              <w:right w:val="single" w:color="22C55E" w:sz="4"/>
-            </w:tcBorders>
-            <w:shd w:fill="22C55E" w:val="clear"/>
+              <w:top w:val="single" w:color="4F6EF7" w:sz="4"/>
+              <w:left w:val="single" w:color="4F6EF7" w:sz="4"/>
+              <w:bottom w:val="single" w:color="4F6EF7" w:sz="4"/>
+              <w:right w:val="single" w:color="4F6EF7" w:sz="4"/>
+            </w:tcBorders>
+            <w:shd w:fill="4F6EF7" w:val="clear"/>
             <w:tcMar>
               <w:top w:type="dxa" w:w="160"/>
               <w:left w:type="dxa" w:w="140"/>
@@ -1803,7 +1803,7 @@
                 <w:sz w:val="36"/>
                 <w:szCs w:val="36"/>
               </w:rPr>
-              <w:t xml:space="preserve">SK</w:t>
+              <w:t xml:space="preserve">ET</w:t>
             </w:r>
           </w:p>
         </w:tc>
@@ -1812,7 +1812,7 @@
             <w:tcW w:type="dxa" w:w="8160"/>
             <w:tcBorders>
               <w:top w:val="single" w:color="CBD5E1" w:sz="4"/>
-              <w:left w:val="single" w:color="22C55E" w:sz="8"/>
+              <w:left w:val="single" w:color="4F6EF7" w:sz="8"/>
               <w:bottom w:val="single" w:color="CBD5E1" w:sz="4"/>
               <w:right w:val="single" w:color="CBD5E1" w:sz="4"/>
             </w:tcBorders>
@@ -1837,7 +1837,7 @@
                 <w:sz w:val="26"/>
                 <w:szCs w:val="26"/>
               </w:rPr>
-              <w:t xml:space="preserve">Sirac Ketenoglu</w:t>
+              <w:t xml:space="preserve">Emre Turan</w:t>
             </w:r>
           </w:p>
           <w:p>
@@ -1851,7 +1851,7 @@
                 <w:sz w:val="20"/>
                 <w:szCs w:val="20"/>
               </w:rPr>
-              <w:t xml:space="preserve">Frontend Lead</w:t>
+              <w:t xml:space="preserve">Auth &amp; Feedback Sistemi</w:t>
             </w:r>
           </w:p>
           <w:p>
@@ -1876,7 +1876,7 @@
                 <w:sz w:val="18"/>
                 <w:szCs w:val="18"/>
               </w:rPr>
-              <w:t xml:space="preserve">feature/frontend-integration</w:t>
+              <w:t xml:space="preserve">feature/auth-and-feedback</w:t>
             </w:r>
           </w:p>
         </w:tc>
@@ -1921,7 +1921,7 @@
           <w:sz w:val="20"/>
           <w:szCs w:val="20"/>
         </w:rPr>
-        <w:t xml:space="preserve">Mevcut demo.html’i gerçek backend API’sine bağla (JavaScript </w:t>
+        <w:t xml:space="preserve">JWT tabanlı Authentication sistemini kur: </w:t>
       </w:r>
       <w:r>
         <w:rPr>
@@ -1930,15 +1930,7 @@
           <w:sz w:val="19"/>
           <w:szCs w:val="19"/>
         </w:rPr>
-        <w:t xml:space="preserve">fetch</w:t>
-      </w:r>
-      <w:r>
-        <w:rPr>
-          <w:rFonts w:ascii="Arial" w:cs="Arial" w:eastAsia="Arial" w:hAnsi="Arial"/>
-          <w:sz w:val="20"/>
-          <w:szCs w:val="20"/>
-        </w:rPr>
-        <w:t xml:space="preserve"> ile)</w:t>
+        <w:t xml:space="preserve">POST /auth/register, POST /auth/login, POST /auth/logout</w:t>
       </w:r>
     </w:p>
     <w:p>
@@ -1956,24 +1948,7 @@
           <w:sz w:val="20"/>
           <w:szCs w:val="20"/>
         </w:rPr>
-        <w:t xml:space="preserve">Dashboard sayfasını </w:t>
-      </w:r>
-      <w:r>
-        <w:rPr>
-          <w:rFonts w:ascii="Consolas" w:cs="Consolas" w:eastAsia="Consolas" w:hAnsi="Consolas"/>
-          <w:color w:val="4F6EF7"/>
-          <w:sz w:val="19"/>
-          <w:szCs w:val="19"/>
-        </w:rPr>
-        <w:t xml:space="preserve">GET /libraries</w:t>
-      </w:r>
-      <w:r>
-        <w:rPr>
-          <w:rFonts w:ascii="Arial" w:cs="Arial" w:eastAsia="Arial" w:hAnsi="Arial"/>
-          <w:sz w:val="20"/>
-          <w:szCs w:val="20"/>
-        </w:rPr>
-        <w:t xml:space="preserve"> endpoint’inden canlı veriyle çalıştır</w:t>
+        <w:t xml:space="preserve">Öğrenci doğrulama mekanizmasını implemente et (yalnızca üniversite e-postası)</w:t>
       </w:r>
     </w:p>
     <w:p>
@@ -1991,7 +1966,7 @@
           <w:sz w:val="20"/>
           <w:szCs w:val="20"/>
         </w:rPr>
-        <w:t xml:space="preserve">Reservation formunu </w:t>
+        <w:t xml:space="preserve">Feedback API endpoint’lerini yaz: </w:t>
       </w:r>
       <w:r>
         <w:rPr>
@@ -2000,15 +1975,7 @@
           <w:sz w:val="19"/>
           <w:szCs w:val="19"/>
         </w:rPr>
-        <w:t xml:space="preserve">POST /reservations</w:t>
-      </w:r>
-      <w:r>
-        <w:rPr>
-          <w:rFonts w:ascii="Arial" w:cs="Arial" w:eastAsia="Arial" w:hAnsi="Arial"/>
-          <w:sz w:val="20"/>
-          <w:szCs w:val="20"/>
-        </w:rPr>
-        <w:t xml:space="preserve"> API’sine bağla</w:t>
+        <w:t xml:space="preserve">POST /feedback, GET /feedback/{libraryId}</w:t>
       </w:r>
     </w:p>
     <w:p>
@@ -2026,24 +1993,7 @@
           <w:sz w:val="20"/>
           <w:szCs w:val="20"/>
         </w:rPr>
-        <w:t xml:space="preserve">Feedback formunu </w:t>
-      </w:r>
-      <w:r>
-        <w:rPr>
-          <w:rFonts w:ascii="Consolas" w:cs="Consolas" w:eastAsia="Consolas" w:hAnsi="Consolas"/>
-          <w:color w:val="4F6EF7"/>
-          <w:sz w:val="19"/>
-          <w:szCs w:val="19"/>
-        </w:rPr>
-        <w:t xml:space="preserve">POST /feedback</w:t>
-      </w:r>
-      <w:r>
-        <w:rPr>
-          <w:rFonts w:ascii="Arial" w:cs="Arial" w:eastAsia="Arial" w:hAnsi="Arial"/>
-          <w:sz w:val="20"/>
-          <w:szCs w:val="20"/>
-        </w:rPr>
-        <w:t xml:space="preserve"> API’sine bağla</w:t>
+        <w:t xml:space="preserve">Fake feedback önleme mekanizmasını yaz (IP bazlı rate limiting, basit filtre)</w:t>
       </w:r>
     </w:p>
     <w:p>
@@ -2061,24 +2011,7 @@
           <w:sz w:val="20"/>
           <w:szCs w:val="20"/>
         </w:rPr>
-        <w:t xml:space="preserve">Admin panosunu </w:t>
-      </w:r>
-      <w:r>
-        <w:rPr>
-          <w:rFonts w:ascii="Consolas" w:cs="Consolas" w:eastAsia="Consolas" w:hAnsi="Consolas"/>
-          <w:color w:val="4F6EF7"/>
-          <w:sz w:val="19"/>
-          <w:szCs w:val="19"/>
-        </w:rPr>
-        <w:t xml:space="preserve">GET /stats</w:t>
-      </w:r>
-      <w:r>
-        <w:rPr>
-          <w:rFonts w:ascii="Arial" w:cs="Arial" w:eastAsia="Arial" w:hAnsi="Arial"/>
-          <w:sz w:val="20"/>
-          <w:szCs w:val="20"/>
-        </w:rPr>
-        <w:t xml:space="preserve"> API’sinden gerçek grafiklerle çalıştır</w:t>
+        <w:t xml:space="preserve">İstatistik ve raporlama API’sini Sirac ile koordineli yaz</w:t>
       </w:r>
     </w:p>
     <w:p>
@@ -2096,7 +2029,7 @@
           <w:sz w:val="20"/>
           <w:szCs w:val="20"/>
         </w:rPr>
-        <w:t xml:space="preserve">Mobil uyumluluk ve cross-browser testleri yap</w:t>
+        <w:t xml:space="preserve">Security review yap: SQL injection, auth bypass, input validation</w:t>
       </w:r>
     </w:p>
     <w:p>
@@ -2114,25 +2047,7 @@
           <w:sz w:val="20"/>
           <w:szCs w:val="20"/>
         </w:rPr>
-        <w:t xml:space="preserve">README.md dosyasını tamamla: kurulum adımları, proje açıklaması, ekip bilgisi, ekran görüntüleri</w:t>
-      </w:r>
-    </w:p>
-    <w:p>
-      <w:pPr>
-        <w:pStyle w:val="ListParagraph"/>
-        <w:numPr>
-          <w:ilvl w:val="0"/>
-          <w:numId w:val="4"/>
-        </w:numPr>
-        <w:spacing w:after="60" w:before="60"/>
-      </w:pPr>
-      <w:r>
-        <w:rPr>
-          <w:rFonts w:ascii="Arial" w:cs="Arial" w:eastAsia="Arial" w:hAnsi="Arial"/>
-          <w:sz w:val="20"/>
-          <w:szCs w:val="20"/>
-        </w:rPr>
-        <w:t xml:space="preserve">Final sunumu için demo’nun son halini hazırla</w:t>
+        <w:t xml:space="preserve">Final raporu için “Güvenlik ve Kimlik Doğrulama” bölümünü yaz</w:t>
       </w:r>
     </w:p>
     <w:p>
@@ -2223,7 +2138,7 @@
                 <w:sz w:val="18"/>
                 <w:szCs w:val="18"/>
               </w:rPr>
-              <w:t xml:space="preserve">git checkout -b feature/frontend-integration</w:t>
+              <w:t xml:space="preserve">git checkout -b feature/auth-and-feedback</w:t>
             </w:r>
           </w:p>
         </w:tc>
@@ -2325,7 +2240,7 @@
                 <w:sz w:val="18"/>
                 <w:szCs w:val="18"/>
               </w:rPr>
-              <w:t xml:space="preserve">git commit -m "Connect frontend dashboard to live API"</w:t>
+              <w:t xml:space="preserve">git commit -m "Add JWT auth system and feedback API"</w:t>
             </w:r>
           </w:p>
         </w:tc>
@@ -2359,7 +2274,7 @@
                 <w:sz w:val="18"/>
                 <w:szCs w:val="18"/>
               </w:rPr>
-              <w:t xml:space="preserve">git push origin feature/frontend-integration</w:t>
+              <w:t xml:space="preserve">git push origin feature/auth-and-feedback</w:t>
             </w:r>
           </w:p>
         </w:tc>
@@ -2393,7 +2308,7 @@
                 <w:sz w:val="18"/>
                 <w:szCs w:val="18"/>
               </w:rPr>
-              <w:t xml:space="preserve"># GitHub'da Pull Request aç, Emre'yi reviewer olarak ekle</w:t>
+              <w:t xml:space="preserve"># GitHub'da Pull Request aç, Sirac'ı reviewer olarak ekle</w:t>
             </w:r>
           </w:p>
         </w:tc>
@@ -2449,7 +2364,7 @@
           <w:sz w:val="24"/>
           <w:szCs w:val="24"/>
         </w:rPr>
-        <w:t xml:space="preserve">3.3 Reis Yıldız – Test &amp; Rezervasyon Sistemi</w:t>
+        <w:t xml:space="preserve">3.3 Reis Yıldız – Frontend Lead</w:t>
       </w:r>
     </w:p>
     <w:p>
@@ -2556,7 +2471,7 @@
                 <w:sz w:val="20"/>
                 <w:szCs w:val="20"/>
               </w:rPr>
-              <w:t xml:space="preserve">Test &amp; Rezervasyon Sistemi</w:t>
+              <w:t xml:space="preserve">Frontend Lead</w:t>
             </w:r>
           </w:p>
           <w:p>
@@ -2581,7 +2496,7 @@
                 <w:sz w:val="18"/>
                 <w:szCs w:val="18"/>
               </w:rPr>
-              <w:t xml:space="preserve">feature/reservation-and-tests</w:t>
+              <w:t xml:space="preserve">feature/frontend-integration</w:t>
             </w:r>
           </w:p>
         </w:tc>
@@ -2626,7 +2541,7 @@
           <w:sz w:val="20"/>
           <w:szCs w:val="20"/>
         </w:rPr>
-        <w:t xml:space="preserve">Rezervasyon API endpoint’lerini yaz: </w:t>
+        <w:t xml:space="preserve">Mevcut demo.html’i gerçek backend API’sine bağla (JavaScript </w:t>
       </w:r>
       <w:r>
         <w:rPr>
@@ -2635,7 +2550,15 @@
           <w:sz w:val="19"/>
           <w:szCs w:val="19"/>
         </w:rPr>
-        <w:t xml:space="preserve">POST /reservations, GET /reservations/{userId}, DELETE /reservations/{id}</w:t>
+        <w:t xml:space="preserve">fetch</w:t>
+      </w:r>
+      <w:r>
+        <w:rPr>
+          <w:rFonts w:ascii="Arial" w:cs="Arial" w:eastAsia="Arial" w:hAnsi="Arial"/>
+          <w:sz w:val="20"/>
+          <w:szCs w:val="20"/>
+        </w:rPr>
+        <w:t xml:space="preserve"> ile)</w:t>
       </w:r>
     </w:p>
     <w:p>
@@ -2653,7 +2576,24 @@
           <w:sz w:val="20"/>
           <w:szCs w:val="20"/>
         </w:rPr>
-        <w:t xml:space="preserve">Çakışan rezervasyon kontrolünü implemente et (aynı koltuk, aynı saat)</w:t>
+        <w:t xml:space="preserve">Dashboard sayfasını </w:t>
+      </w:r>
+      <w:r>
+        <w:rPr>
+          <w:rFonts w:ascii="Consolas" w:cs="Consolas" w:eastAsia="Consolas" w:hAnsi="Consolas"/>
+          <w:color w:val="4F6EF7"/>
+          <w:sz w:val="19"/>
+          <w:szCs w:val="19"/>
+        </w:rPr>
+        <w:t xml:space="preserve">GET /libraries</w:t>
+      </w:r>
+      <w:r>
+        <w:rPr>
+          <w:rFonts w:ascii="Arial" w:cs="Arial" w:eastAsia="Arial" w:hAnsi="Arial"/>
+          <w:sz w:val="20"/>
+          <w:szCs w:val="20"/>
+        </w:rPr>
+        <w:t xml:space="preserve"> endpoint’inden canlı veriyle çalıştır</w:t>
       </w:r>
     </w:p>
     <w:p>
@@ -2671,7 +2611,7 @@
           <w:sz w:val="20"/>
           <w:szCs w:val="20"/>
         </w:rPr>
-        <w:t xml:space="preserve">pytest test ortamını kur (</w:t>
+        <w:t xml:space="preserve">Reservation formunu </w:t>
       </w:r>
       <w:r>
         <w:rPr>
@@ -2680,7 +2620,7 @@
           <w:sz w:val="19"/>
           <w:szCs w:val="19"/>
         </w:rPr>
-        <w:t xml:space="preserve">conftest.py</w:t>
+        <w:t xml:space="preserve">POST /reservations</w:t>
       </w:r>
       <w:r>
         <w:rPr>
@@ -2688,7 +2628,7 @@
           <w:sz w:val="20"/>
           <w:szCs w:val="20"/>
         </w:rPr>
-        <w:t xml:space="preserve">, fixtures)</w:t>
+        <w:t xml:space="preserve"> API’sine bağla</w:t>
       </w:r>
     </w:p>
     <w:p>
@@ -2706,7 +2646,24 @@
           <w:sz w:val="20"/>
           <w:szCs w:val="20"/>
         </w:rPr>
-        <w:t xml:space="preserve">Authentication akışı için unit testler yaz (en az 5 test)</w:t>
+        <w:t xml:space="preserve">Feedback formunu </w:t>
+      </w:r>
+      <w:r>
+        <w:rPr>
+          <w:rFonts w:ascii="Consolas" w:cs="Consolas" w:eastAsia="Consolas" w:hAnsi="Consolas"/>
+          <w:color w:val="4F6EF7"/>
+          <w:sz w:val="19"/>
+          <w:szCs w:val="19"/>
+        </w:rPr>
+        <w:t xml:space="preserve">POST /feedback</w:t>
+      </w:r>
+      <w:r>
+        <w:rPr>
+          <w:rFonts w:ascii="Arial" w:cs="Arial" w:eastAsia="Arial" w:hAnsi="Arial"/>
+          <w:sz w:val="20"/>
+          <w:szCs w:val="20"/>
+        </w:rPr>
+        <w:t xml:space="preserve"> API’sine bağla</w:t>
       </w:r>
     </w:p>
     <w:p>
@@ -2724,7 +2681,24 @@
           <w:sz w:val="20"/>
           <w:szCs w:val="20"/>
         </w:rPr>
-        <w:t xml:space="preserve">Rezervasyon sistemi için unit ve entegrasyon testleri yaz (en az 8 test)</w:t>
+        <w:t xml:space="preserve">Admin panosunu </w:t>
+      </w:r>
+      <w:r>
+        <w:rPr>
+          <w:rFonts w:ascii="Consolas" w:cs="Consolas" w:eastAsia="Consolas" w:hAnsi="Consolas"/>
+          <w:color w:val="4F6EF7"/>
+          <w:sz w:val="19"/>
+          <w:szCs w:val="19"/>
+        </w:rPr>
+        <w:t xml:space="preserve">GET /stats</w:t>
+      </w:r>
+      <w:r>
+        <w:rPr>
+          <w:rFonts w:ascii="Arial" w:cs="Arial" w:eastAsia="Arial" w:hAnsi="Arial"/>
+          <w:sz w:val="20"/>
+          <w:szCs w:val="20"/>
+        </w:rPr>
+        <w:t xml:space="preserve"> API’sinden gerçek grafiklerle çalıştır</w:t>
       </w:r>
     </w:p>
     <w:p>
@@ -2742,7 +2716,7 @@
           <w:sz w:val="20"/>
           <w:szCs w:val="20"/>
         </w:rPr>
-        <w:t xml:space="preserve">Tüm test suite’i çalıştır, hata raporu hazırla</w:t>
+        <w:t xml:space="preserve">Mobil uyumluluk ve cross-browser testleri yap</w:t>
       </w:r>
     </w:p>
     <w:p>
@@ -2760,7 +2734,7 @@
           <w:sz w:val="20"/>
           <w:szCs w:val="20"/>
         </w:rPr>
-        <w:t xml:space="preserve">Final raporu için “Test ve Doğrulama” bölümünü yaz</w:t>
+        <w:t xml:space="preserve">README.md dosyasını tamamla: kurulum adımları, proje açıklaması, ekip bilgisi, ekran görüntüleri</w:t>
       </w:r>
     </w:p>
     <w:p>
@@ -2778,7 +2752,7 @@
           <w:sz w:val="20"/>
           <w:szCs w:val="20"/>
         </w:rPr>
-        <w:t xml:space="preserve">Sistem Doğrulama raporunu hazırla (Hafta 12 teslimi)</w:t>
+        <w:t xml:space="preserve">Final sunumu için demo’nun son halini hazırla</w:t>
       </w:r>
     </w:p>
     <w:p>
@@ -2869,7 +2843,7 @@
                 <w:sz w:val="18"/>
                 <w:szCs w:val="18"/>
               </w:rPr>
-              <w:t xml:space="preserve">git checkout -b feature/reservation-and-tests</w:t>
+              <w:t xml:space="preserve">git checkout -b feature/frontend-integration</w:t>
             </w:r>
           </w:p>
         </w:tc>
@@ -2903,7 +2877,7 @@
                 <w:sz w:val="18"/>
                 <w:szCs w:val="18"/>
               </w:rPr>
-              <w:t xml:space="preserve"># Kodunu yaz ve testleri çalıştır</w:t>
+              <w:t xml:space="preserve"># Kodunu yaz ve test et</w:t>
             </w:r>
           </w:p>
         </w:tc>
@@ -2971,7 +2945,7 @@
                 <w:sz w:val="18"/>
                 <w:szCs w:val="18"/>
               </w:rPr>
-              <w:t xml:space="preserve">git commit -m "Add reservation API and pytest test suite"</w:t>
+              <w:t xml:space="preserve">git commit -m "Connect frontend dashboard to live API"</w:t>
             </w:r>
           </w:p>
         </w:tc>
@@ -3005,7 +2979,7 @@
                 <w:sz w:val="18"/>
                 <w:szCs w:val="18"/>
               </w:rPr>
-              <w:t xml:space="preserve">git push origin feature/reservation-and-tests</w:t>
+              <w:t xml:space="preserve">git push origin feature/frontend-integration</w:t>
             </w:r>
           </w:p>
         </w:tc>
@@ -3039,7 +3013,7 @@
                 <w:sz w:val="18"/>
                 <w:szCs w:val="18"/>
               </w:rPr>
-              <w:t xml:space="preserve"># GitHub'da Pull Request aç, Barış'ı reviewer olarak ekle</w:t>
+              <w:t xml:space="preserve"># GitHub'da Pull Request aç, Sirac'ı reviewer olarak ekle</w:t>
             </w:r>
           </w:p>
         </w:tc>
@@ -3095,7 +3069,7 @@
           <w:sz w:val="24"/>
           <w:szCs w:val="24"/>
         </w:rPr>
-        <w:t xml:space="preserve">3.4 Barış Küçükkıya – Auth &amp; Feedback Sistemi</w:t>
+        <w:t xml:space="preserve">3.4 Barış Küçükkıya – Test &amp; Rezervasyon Sistemi</w:t>
       </w:r>
     </w:p>
     <w:p>
@@ -3202,7 +3176,7 @@
                 <w:sz w:val="20"/>
                 <w:szCs w:val="20"/>
               </w:rPr>
-              <w:t xml:space="preserve">Auth &amp; Feedback Sistemi</w:t>
+              <w:t xml:space="preserve">Test &amp; Rezervasyon Sistemi</w:t>
             </w:r>
           </w:p>
           <w:p>
@@ -3227,7 +3201,7 @@
                 <w:sz w:val="18"/>
                 <w:szCs w:val="18"/>
               </w:rPr>
-              <w:t xml:space="preserve">feature/auth-and-feedback</w:t>
+              <w:t xml:space="preserve">feature/reservation-and-tests</w:t>
             </w:r>
           </w:p>
         </w:tc>
@@ -3272,7 +3246,7 @@
           <w:sz w:val="20"/>
           <w:szCs w:val="20"/>
         </w:rPr>
-        <w:t xml:space="preserve">JWT tabanlı Authentication sistemini kur: </w:t>
+        <w:t xml:space="preserve">Rezervasyon API endpoint’lerini yaz: </w:t>
       </w:r>
       <w:r>
         <w:rPr>
@@ -3281,7 +3255,7 @@
           <w:sz w:val="19"/>
           <w:szCs w:val="19"/>
         </w:rPr>
-        <w:t xml:space="preserve">POST /auth/register, POST /auth/login, POST /auth/logout</w:t>
+        <w:t xml:space="preserve">POST /reservations, GET /reservations/{userId}, DELETE /reservations/{id}</w:t>
       </w:r>
     </w:p>
     <w:p>
@@ -3299,7 +3273,7 @@
           <w:sz w:val="20"/>
           <w:szCs w:val="20"/>
         </w:rPr>
-        <w:t xml:space="preserve">Öğrenci doğrulama mekanizmasını implemente et (yalnızca üniversite e-postası)</w:t>
+        <w:t xml:space="preserve">Çakışan rezervasyon kontrolünü implemente et (aynı koltuk, aynı saat)</w:t>
       </w:r>
     </w:p>
     <w:p>
@@ -3317,7 +3291,7 @@
           <w:sz w:val="20"/>
           <w:szCs w:val="20"/>
         </w:rPr>
-        <w:t xml:space="preserve">Feedback API endpoint’lerini yaz: </w:t>
+        <w:t xml:space="preserve">pytest test ortamını kur (</w:t>
       </w:r>
       <w:r>
         <w:rPr>
@@ -3326,7 +3300,15 @@
           <w:sz w:val="19"/>
           <w:szCs w:val="19"/>
         </w:rPr>
-        <w:t xml:space="preserve">POST /feedback, GET /feedback/{libraryId}</w:t>
+        <w:t xml:space="preserve">conftest.py</w:t>
+      </w:r>
+      <w:r>
+        <w:rPr>
+          <w:rFonts w:ascii="Arial" w:cs="Arial" w:eastAsia="Arial" w:hAnsi="Arial"/>
+          <w:sz w:val="20"/>
+          <w:szCs w:val="20"/>
+        </w:rPr>
+        <w:t xml:space="preserve">, fixtures)</w:t>
       </w:r>
     </w:p>
     <w:p>
@@ -3344,7 +3326,7 @@
           <w:sz w:val="20"/>
           <w:szCs w:val="20"/>
         </w:rPr>
-        <w:t xml:space="preserve">Fake feedback önleme mekanizmasını yaz (IP bazlı rate limiting, basit filtre)</w:t>
+        <w:t xml:space="preserve">Authentication akışı için unit testler yaz (en az 5 test)</w:t>
       </w:r>
     </w:p>
     <w:p>
@@ -3362,7 +3344,7 @@
           <w:sz w:val="20"/>
           <w:szCs w:val="20"/>
         </w:rPr>
-        <w:t xml:space="preserve">İstatistik ve raporlama API’sini Emre ile koordineli yaz</w:t>
+        <w:t xml:space="preserve">Rezervasyon sistemi için unit ve entegrasyon testleri yaz (en az 8 test)</w:t>
       </w:r>
     </w:p>
     <w:p>
@@ -3380,7 +3362,343 @@
           <w:sz w:val="20"/>
           <w:szCs w:val="20"/>
         </w:rPr>
-        <w:t xml:space="preserve">Security review yap: SQL injection, auth bypass, input validation</w:t>
+        <w:t xml:space="preserve">Tüm test suite’i çalıştır, hata raporu hazırla</w:t>
+      </w:r>
+    </w:p>
+    <w:p>
+      <w:pPr>
+        <w:pStyle w:val="ListParagraph"/>
+        <w:numPr>
+          <w:ilvl w:val="0"/>
+          <w:numId w:val="6"/>
+        </w:numPr>
+        <w:spacing w:after="60" w:before="60"/>
+      </w:pPr>
+      <w:r>
+        <w:rPr>
+          <w:rFonts w:ascii="Arial" w:cs="Arial" w:eastAsia="Arial" w:hAnsi="Arial"/>
+          <w:sz w:val="20"/>
+          <w:szCs w:val="20"/>
+        </w:rPr>
+        <w:t xml:space="preserve">Final raporu için “Test ve Doğrulama” bölümünü yaz</w:t>
+      </w:r>
+    </w:p>
+    <w:p>
+      <w:pPr>
+        <w:pStyle w:val="ListParagraph"/>
+        <w:numPr>
+          <w:ilvl w:val="0"/>
+          <w:numId w:val="6"/>
+        </w:numPr>
+        <w:spacing w:after="60" w:before="60"/>
+      </w:pPr>
+      <w:r>
+        <w:rPr>
+          <w:rFonts w:ascii="Arial" w:cs="Arial" w:eastAsia="Arial" w:hAnsi="Arial"/>
+          <w:sz w:val="20"/>
+          <w:szCs w:val="20"/>
+        </w:rPr>
+        <w:t xml:space="preserve">Sistem Doğrulama raporunu hazırla (Hafta 12 teslimi)</w:t>
+      </w:r>
+    </w:p>
+    <w:p>
+      <w:pPr>
+        <w:spacing w:after="0" w:before="120"/>
+      </w:pPr>
+      <w:r>
+        <w:t xml:space="preserve"/>
+      </w:r>
+    </w:p>
+    <w:tbl>
+      <w:tblPr>
+        <w:tblW w:type="dxa" w:w="9360"/>
+        <w:tblBorders>
+          <w:top w:val="single" w:color="auto" w:sz="4"/>
+          <w:left w:val="single" w:color="auto" w:sz="4"/>
+          <w:bottom w:val="single" w:color="auto" w:sz="4"/>
+          <w:right w:val="single" w:color="auto" w:sz="4"/>
+          <w:insideH w:val="single" w:color="auto" w:sz="4"/>
+          <w:insideV w:val="single" w:color="auto" w:sz="4"/>
+        </w:tblBorders>
+      </w:tblPr>
+      <w:tblGrid>
+        <w:gridCol w:w="9360"/>
+      </w:tblGrid>
+      <w:tr>
+        <w:tc>
+          <w:tcPr>
+            <w:tcW w:type="dxa" w:w="9360"/>
+            <w:tcBorders>
+              <w:top w:val="single" w:color="334155" w:sz="4"/>
+              <w:left w:val="single" w:color="334155" w:sz="4"/>
+              <w:bottom w:val="single" w:color="334155" w:sz="4"/>
+              <w:right w:val="single" w:color="334155" w:sz="4"/>
+            </w:tcBorders>
+            <w:shd w:fill="1E293B" w:val="clear"/>
+            <w:tcMar>
+              <w:top w:type="dxa" w:w="60"/>
+              <w:left w:type="dxa" w:w="200"/>
+              <w:bottom w:type="dxa" w:w="60"/>
+              <w:right w:type="dxa" w:w="200"/>
+            </w:tcMar>
+          </w:tcPr>
+          <w:p>
+            <w:pPr>
+              <w:spacing w:after="0" w:before="0"/>
+            </w:pPr>
+            <w:r>
+              <w:rPr>
+                <w:rFonts w:ascii="Arial" w:cs="Arial" w:eastAsia="Arial" w:hAnsi="Arial"/>
+                <w:b/>
+                <w:bCs/>
+                <w:color w:val="7C9EFF"/>
+                <w:sz w:val="18"/>
+                <w:szCs w:val="18"/>
+              </w:rPr>
+              <w:t xml:space="preserve">  GitHub’a Push Adımları</w:t>
+            </w:r>
+          </w:p>
+        </w:tc>
+      </w:tr>
+      <w:tr>
+        <w:tc>
+          <w:tcPr>
+            <w:tcW w:type="dxa" w:w="9360"/>
+            <w:tcBorders>
+              <w:top w:val="none" w:color="FFFFFF" w:sz="0"/>
+              <w:left w:val="single" w:color="334155" w:sz="4"/>
+              <w:bottom w:val="none" w:color="FFFFFF" w:sz="0"/>
+              <w:right w:val="single" w:color="334155" w:sz="4"/>
+            </w:tcBorders>
+            <w:shd w:fill="0F172A" w:val="clear"/>
+            <w:tcMar>
+              <w:top w:type="dxa" w:w="40"/>
+              <w:left w:type="dxa" w:w="200"/>
+              <w:bottom w:type="dxa" w:w="40"/>
+              <w:right w:type="dxa" w:w="200"/>
+            </w:tcMar>
+          </w:tcPr>
+          <w:p>
+            <w:pPr>
+              <w:spacing w:after="0" w:before="0"/>
+            </w:pPr>
+            <w:r>
+              <w:rPr>
+                <w:rFonts w:ascii="Consolas" w:cs="Consolas" w:eastAsia="Consolas" w:hAnsi="Consolas"/>
+                <w:color w:val="86EFAC"/>
+                <w:sz w:val="18"/>
+                <w:szCs w:val="18"/>
+              </w:rPr>
+              <w:t xml:space="preserve">git checkout -b feature/reservation-and-tests</w:t>
+            </w:r>
+          </w:p>
+        </w:tc>
+      </w:tr>
+      <w:tr>
+        <w:tc>
+          <w:tcPr>
+            <w:tcW w:type="dxa" w:w="9360"/>
+            <w:tcBorders>
+              <w:top w:val="none" w:color="FFFFFF" w:sz="0"/>
+              <w:left w:val="single" w:color="334155" w:sz="4"/>
+              <w:bottom w:val="none" w:color="FFFFFF" w:sz="0"/>
+              <w:right w:val="single" w:color="334155" w:sz="4"/>
+            </w:tcBorders>
+            <w:shd w:fill="0F172A" w:val="clear"/>
+            <w:tcMar>
+              <w:top w:type="dxa" w:w="40"/>
+              <w:left w:type="dxa" w:w="200"/>
+              <w:bottom w:type="dxa" w:w="40"/>
+              <w:right w:type="dxa" w:w="200"/>
+            </w:tcMar>
+          </w:tcPr>
+          <w:p>
+            <w:pPr>
+              <w:spacing w:after="0" w:before="0"/>
+            </w:pPr>
+            <w:r>
+              <w:rPr>
+                <w:rFonts w:ascii="Consolas" w:cs="Consolas" w:eastAsia="Consolas" w:hAnsi="Consolas"/>
+                <w:color w:val="86EFAC"/>
+                <w:sz w:val="18"/>
+                <w:szCs w:val="18"/>
+              </w:rPr>
+              <w:t xml:space="preserve"># Kodunu yaz ve testleri çalıştır</w:t>
+            </w:r>
+          </w:p>
+        </w:tc>
+      </w:tr>
+      <w:tr>
+        <w:tc>
+          <w:tcPr>
+            <w:tcW w:type="dxa" w:w="9360"/>
+            <w:tcBorders>
+              <w:top w:val="none" w:color="FFFFFF" w:sz="0"/>
+              <w:left w:val="single" w:color="334155" w:sz="4"/>
+              <w:bottom w:val="none" w:color="FFFFFF" w:sz="0"/>
+              <w:right w:val="single" w:color="334155" w:sz="4"/>
+            </w:tcBorders>
+            <w:shd w:fill="0F172A" w:val="clear"/>
+            <w:tcMar>
+              <w:top w:type="dxa" w:w="40"/>
+              <w:left w:type="dxa" w:w="200"/>
+              <w:bottom w:type="dxa" w:w="40"/>
+              <w:right w:type="dxa" w:w="200"/>
+            </w:tcMar>
+          </w:tcPr>
+          <w:p>
+            <w:pPr>
+              <w:spacing w:after="0" w:before="0"/>
+            </w:pPr>
+            <w:r>
+              <w:rPr>
+                <w:rFonts w:ascii="Consolas" w:cs="Consolas" w:eastAsia="Consolas" w:hAnsi="Consolas"/>
+                <w:color w:val="86EFAC"/>
+                <w:sz w:val="18"/>
+                <w:szCs w:val="18"/>
+              </w:rPr>
+              <w:t xml:space="preserve">git add .</w:t>
+            </w:r>
+          </w:p>
+        </w:tc>
+      </w:tr>
+      <w:tr>
+        <w:tc>
+          <w:tcPr>
+            <w:tcW w:type="dxa" w:w="9360"/>
+            <w:tcBorders>
+              <w:top w:val="none" w:color="FFFFFF" w:sz="0"/>
+              <w:left w:val="single" w:color="334155" w:sz="4"/>
+              <w:bottom w:val="none" w:color="FFFFFF" w:sz="0"/>
+              <w:right w:val="single" w:color="334155" w:sz="4"/>
+            </w:tcBorders>
+            <w:shd w:fill="0F172A" w:val="clear"/>
+            <w:tcMar>
+              <w:top w:type="dxa" w:w="40"/>
+              <w:left w:type="dxa" w:w="200"/>
+              <w:bottom w:type="dxa" w:w="40"/>
+              <w:right w:type="dxa" w:w="200"/>
+            </w:tcMar>
+          </w:tcPr>
+          <w:p>
+            <w:pPr>
+              <w:spacing w:after="0" w:before="0"/>
+            </w:pPr>
+            <w:r>
+              <w:rPr>
+                <w:rFonts w:ascii="Consolas" w:cs="Consolas" w:eastAsia="Consolas" w:hAnsi="Consolas"/>
+                <w:color w:val="86EFAC"/>
+                <w:sz w:val="18"/>
+                <w:szCs w:val="18"/>
+              </w:rPr>
+              <w:t xml:space="preserve">git commit -m "Add reservation API and pytest test suite"</w:t>
+            </w:r>
+          </w:p>
+        </w:tc>
+      </w:tr>
+      <w:tr>
+        <w:tc>
+          <w:tcPr>
+            <w:tcW w:type="dxa" w:w="9360"/>
+            <w:tcBorders>
+              <w:top w:val="none" w:color="FFFFFF" w:sz="0"/>
+              <w:left w:val="single" w:color="334155" w:sz="4"/>
+              <w:bottom w:val="none" w:color="FFFFFF" w:sz="0"/>
+              <w:right w:val="single" w:color="334155" w:sz="4"/>
+            </w:tcBorders>
+            <w:shd w:fill="0F172A" w:val="clear"/>
+            <w:tcMar>
+              <w:top w:type="dxa" w:w="40"/>
+              <w:left w:type="dxa" w:w="200"/>
+              <w:bottom w:type="dxa" w:w="40"/>
+              <w:right w:type="dxa" w:w="200"/>
+            </w:tcMar>
+          </w:tcPr>
+          <w:p>
+            <w:pPr>
+              <w:spacing w:after="0" w:before="0"/>
+            </w:pPr>
+            <w:r>
+              <w:rPr>
+                <w:rFonts w:ascii="Consolas" w:cs="Consolas" w:eastAsia="Consolas" w:hAnsi="Consolas"/>
+                <w:color w:val="86EFAC"/>
+                <w:sz w:val="18"/>
+                <w:szCs w:val="18"/>
+              </w:rPr>
+              <w:t xml:space="preserve">git push origin feature/reservation-and-tests</w:t>
+            </w:r>
+          </w:p>
+        </w:tc>
+      </w:tr>
+      <w:tr>
+        <w:tc>
+          <w:tcPr>
+            <w:tcW w:type="dxa" w:w="9360"/>
+            <w:tcBorders>
+              <w:top w:val="none" w:color="FFFFFF" w:sz="0"/>
+              <w:left w:val="single" w:color="334155" w:sz="4"/>
+              <w:bottom w:val="none" w:color="FFFFFF" w:sz="0"/>
+              <w:right w:val="single" w:color="334155" w:sz="4"/>
+            </w:tcBorders>
+            <w:shd w:fill="0F172A" w:val="clear"/>
+            <w:tcMar>
+              <w:top w:type="dxa" w:w="40"/>
+              <w:left w:type="dxa" w:w="200"/>
+              <w:bottom w:type="dxa" w:w="40"/>
+              <w:right w:type="dxa" w:w="200"/>
+            </w:tcMar>
+          </w:tcPr>
+          <w:p>
+            <w:pPr>
+              <w:spacing w:after="0" w:before="0"/>
+            </w:pPr>
+            <w:r>
+              <w:rPr>
+                <w:rFonts w:ascii="Consolas" w:cs="Consolas" w:eastAsia="Consolas" w:hAnsi="Consolas"/>
+                <w:color w:val="86EFAC"/>
+                <w:sz w:val="18"/>
+                <w:szCs w:val="18"/>
+              </w:rPr>
+              <w:t xml:space="preserve"># GitHub'da Pull Request aç, Emre'yi reviewer olarak ekle</w:t>
+            </w:r>
+          </w:p>
+        </w:tc>
+      </w:tr>
+      <w:tr>
+        <w:tc>
+          <w:tcPr>
+            <w:tcW w:type="dxa" w:w="9360"/>
+            <w:tcBorders>
+              <w:top w:val="none" w:color="FFFFFF" w:sz="0"/>
+              <w:left w:val="single" w:color="334155" w:sz="4"/>
+              <w:bottom w:val="single" w:color="334155" w:sz="4"/>
+              <w:right w:val="single" w:color="334155" w:sz="4"/>
+            </w:tcBorders>
+            <w:shd w:fill="0F172A" w:val="clear"/>
+            <w:tcMar>
+              <w:top w:type="dxa" w:w="40"/>
+              <w:left w:type="dxa" w:w="200"/>
+              <w:bottom w:type="dxa" w:w="40"/>
+              <w:right w:type="dxa" w:w="200"/>
+            </w:tcMar>
+          </w:tcPr>
+          <w:p>
+            <w:pPr>
+              <w:spacing w:after="0" w:before="0"/>
+            </w:pPr>
+            <w:r>
+              <w:t xml:space="preserve"/>
+            </w:r>
+          </w:p>
+        </w:tc>
+      </w:tr>
+    </w:tbl>
+    <w:p>
+      <w:pPr>
+        <w:spacing w:after="0" w:before="300"/>
+      </w:pPr>
+      <w:r>
+        <w:t xml:space="preserve"/>
       </w:r>
     </w:p>
     <w:p>
@@ -4010,7 +4328,7 @@
                 <w:sz w:val="19"/>
                 <w:szCs w:val="19"/>
               </w:rPr>
-              <w:t xml:space="preserve">Emre + Barış ⚠️</w:t>
+              <w:t xml:space="preserve">Sirac + Emre ⚠️</w:t>
             </w:r>
           </w:p>
         </w:tc>
@@ -4262,7 +4580,7 @@
                 <w:sz w:val="19"/>
                 <w:szCs w:val="19"/>
               </w:rPr>
-              <w:t xml:space="preserve">Reis + Sirac ⚠️</w:t>
+              <w:t xml:space="preserve">Barış + Reis ⚠️</w:t>
             </w:r>
           </w:p>
         </w:tc>

</xml_diff>